<commit_message>
biểu thị chính xác xác suất thời tiết mưa và biểu diễn trong 3 ngày
</commit_message>
<xml_diff>
--- a/Dự án dự báo thời tiết với Machine Learning (thành phố Đà Nẵng).docx
+++ b/Dự án dự báo thời tiết với Machine Learning (thành phố Đà Nẵng).docx
@@ -12,7 +12,6 @@
           <w:lang w:val="en-US"/>
         </w:rPr>
       </w:pPr>
-      <w:proofErr w:type="spellStart"/>
       <w:r>
         <w:rPr>
           <w:rFonts w:ascii="Times New Roman" w:hAnsi="Times New Roman" w:cs="Times New Roman"/>
@@ -20,209 +19,8 @@
           <w:szCs w:val="28"/>
           <w:lang w:val="en-US"/>
         </w:rPr>
-        <w:t>Sử</w:t>
+        <w:t>Sử dụng thuật toán XGBoost và forest random để thực hiện dự án</w:t>
       </w:r>
-      <w:proofErr w:type="spellEnd"/>
-      <w:r>
-        <w:rPr>
-          <w:rFonts w:ascii="Times New Roman" w:hAnsi="Times New Roman" w:cs="Times New Roman"/>
-          <w:sz w:val="28"/>
-          <w:szCs w:val="28"/>
-          <w:lang w:val="en-US"/>
-        </w:rPr>
-        <w:t xml:space="preserve"> </w:t>
-      </w:r>
-      <w:proofErr w:type="spellStart"/>
-      <w:r>
-        <w:rPr>
-          <w:rFonts w:ascii="Times New Roman" w:hAnsi="Times New Roman" w:cs="Times New Roman"/>
-          <w:sz w:val="28"/>
-          <w:szCs w:val="28"/>
-          <w:lang w:val="en-US"/>
-        </w:rPr>
-        <w:t>dụng</w:t>
-      </w:r>
-      <w:proofErr w:type="spellEnd"/>
-      <w:r>
-        <w:rPr>
-          <w:rFonts w:ascii="Times New Roman" w:hAnsi="Times New Roman" w:cs="Times New Roman"/>
-          <w:sz w:val="28"/>
-          <w:szCs w:val="28"/>
-          <w:lang w:val="en-US"/>
-        </w:rPr>
-        <w:t xml:space="preserve"> </w:t>
-      </w:r>
-      <w:proofErr w:type="spellStart"/>
-      <w:r>
-        <w:rPr>
-          <w:rFonts w:ascii="Times New Roman" w:hAnsi="Times New Roman" w:cs="Times New Roman"/>
-          <w:sz w:val="28"/>
-          <w:szCs w:val="28"/>
-          <w:lang w:val="en-US"/>
-        </w:rPr>
-        <w:t>thuật</w:t>
-      </w:r>
-      <w:proofErr w:type="spellEnd"/>
-      <w:r>
-        <w:rPr>
-          <w:rFonts w:ascii="Times New Roman" w:hAnsi="Times New Roman" w:cs="Times New Roman"/>
-          <w:sz w:val="28"/>
-          <w:szCs w:val="28"/>
-          <w:lang w:val="en-US"/>
-        </w:rPr>
-        <w:t xml:space="preserve"> </w:t>
-      </w:r>
-      <w:proofErr w:type="spellStart"/>
-      <w:r>
-        <w:rPr>
-          <w:rFonts w:ascii="Times New Roman" w:hAnsi="Times New Roman" w:cs="Times New Roman"/>
-          <w:sz w:val="28"/>
-          <w:szCs w:val="28"/>
-          <w:lang w:val="en-US"/>
-        </w:rPr>
-        <w:t>toán</w:t>
-      </w:r>
-      <w:proofErr w:type="spellEnd"/>
-      <w:r>
-        <w:rPr>
-          <w:rFonts w:ascii="Times New Roman" w:hAnsi="Times New Roman" w:cs="Times New Roman"/>
-          <w:sz w:val="28"/>
-          <w:szCs w:val="28"/>
-          <w:lang w:val="en-US"/>
-        </w:rPr>
-        <w:t xml:space="preserve"> </w:t>
-      </w:r>
-      <w:proofErr w:type="spellStart"/>
-      <w:r>
-        <w:rPr>
-          <w:rFonts w:ascii="Times New Roman" w:hAnsi="Times New Roman" w:cs="Times New Roman"/>
-          <w:sz w:val="28"/>
-          <w:szCs w:val="28"/>
-          <w:lang w:val="en-US"/>
-        </w:rPr>
-        <w:t>XGBoost</w:t>
-      </w:r>
-      <w:proofErr w:type="spellEnd"/>
-      <w:r>
-        <w:rPr>
-          <w:rFonts w:ascii="Times New Roman" w:hAnsi="Times New Roman" w:cs="Times New Roman"/>
-          <w:sz w:val="28"/>
-          <w:szCs w:val="28"/>
-          <w:lang w:val="en-US"/>
-        </w:rPr>
-        <w:t xml:space="preserve"> </w:t>
-      </w:r>
-      <w:proofErr w:type="spellStart"/>
-      <w:r>
-        <w:rPr>
-          <w:rFonts w:ascii="Times New Roman" w:hAnsi="Times New Roman" w:cs="Times New Roman"/>
-          <w:sz w:val="28"/>
-          <w:szCs w:val="28"/>
-          <w:lang w:val="en-US"/>
-        </w:rPr>
-        <w:t>và</w:t>
-      </w:r>
-      <w:proofErr w:type="spellEnd"/>
-      <w:r>
-        <w:rPr>
-          <w:rFonts w:ascii="Times New Roman" w:hAnsi="Times New Roman" w:cs="Times New Roman"/>
-          <w:sz w:val="28"/>
-          <w:szCs w:val="28"/>
-          <w:lang w:val="en-US"/>
-        </w:rPr>
-        <w:t xml:space="preserve"> forest random </w:t>
-      </w:r>
-      <w:proofErr w:type="spellStart"/>
-      <w:r>
-        <w:rPr>
-          <w:rFonts w:ascii="Times New Roman" w:hAnsi="Times New Roman" w:cs="Times New Roman"/>
-          <w:sz w:val="28"/>
-          <w:szCs w:val="28"/>
-          <w:lang w:val="en-US"/>
-        </w:rPr>
-        <w:t>để</w:t>
-      </w:r>
-      <w:proofErr w:type="spellEnd"/>
-      <w:r>
-        <w:rPr>
-          <w:rFonts w:ascii="Times New Roman" w:hAnsi="Times New Roman" w:cs="Times New Roman"/>
-          <w:sz w:val="28"/>
-          <w:szCs w:val="28"/>
-          <w:lang w:val="en-US"/>
-        </w:rPr>
-        <w:t xml:space="preserve"> </w:t>
-      </w:r>
-      <w:proofErr w:type="spellStart"/>
-      <w:r>
-        <w:rPr>
-          <w:rFonts w:ascii="Times New Roman" w:hAnsi="Times New Roman" w:cs="Times New Roman"/>
-          <w:sz w:val="28"/>
-          <w:szCs w:val="28"/>
-          <w:lang w:val="en-US"/>
-        </w:rPr>
-        <w:t>thực</w:t>
-      </w:r>
-      <w:proofErr w:type="spellEnd"/>
-      <w:r>
-        <w:rPr>
-          <w:rFonts w:ascii="Times New Roman" w:hAnsi="Times New Roman" w:cs="Times New Roman"/>
-          <w:sz w:val="28"/>
-          <w:szCs w:val="28"/>
-          <w:lang w:val="en-US"/>
-        </w:rPr>
-        <w:t xml:space="preserve"> </w:t>
-      </w:r>
-      <w:proofErr w:type="spellStart"/>
-      <w:r>
-        <w:rPr>
-          <w:rFonts w:ascii="Times New Roman" w:hAnsi="Times New Roman" w:cs="Times New Roman"/>
-          <w:sz w:val="28"/>
-          <w:szCs w:val="28"/>
-          <w:lang w:val="en-US"/>
-        </w:rPr>
-        <w:t>hiện</w:t>
-      </w:r>
-      <w:proofErr w:type="spellEnd"/>
-      <w:r>
-        <w:rPr>
-          <w:rFonts w:ascii="Times New Roman" w:hAnsi="Times New Roman" w:cs="Times New Roman"/>
-          <w:sz w:val="28"/>
-          <w:szCs w:val="28"/>
-          <w:lang w:val="en-US"/>
-        </w:rPr>
-        <w:t xml:space="preserve"> </w:t>
-      </w:r>
-      <w:proofErr w:type="spellStart"/>
-      <w:r>
-        <w:rPr>
-          <w:rFonts w:ascii="Times New Roman" w:hAnsi="Times New Roman" w:cs="Times New Roman"/>
-          <w:sz w:val="28"/>
-          <w:szCs w:val="28"/>
-          <w:lang w:val="en-US"/>
-        </w:rPr>
-        <w:t>dự</w:t>
-      </w:r>
-      <w:proofErr w:type="spellEnd"/>
-      <w:r>
-        <w:rPr>
-          <w:rFonts w:ascii="Times New Roman" w:hAnsi="Times New Roman" w:cs="Times New Roman"/>
-          <w:sz w:val="28"/>
-          <w:szCs w:val="28"/>
-          <w:lang w:val="en-US"/>
-        </w:rPr>
-        <w:t xml:space="preserve"> </w:t>
-      </w:r>
-      <w:proofErr w:type="spellStart"/>
-      <w:r>
-        <w:rPr>
-          <w:rFonts w:ascii="Times New Roman" w:hAnsi="Times New Roman" w:cs="Times New Roman"/>
-          <w:sz w:val="28"/>
-          <w:szCs w:val="28"/>
-          <w:lang w:val="en-US"/>
-        </w:rPr>
-        <w:t>án</w:t>
-      </w:r>
-      <w:proofErr w:type="spellEnd"/>
     </w:p>
     <w:p>
       <w:pPr>
@@ -245,127 +43,7 @@
           <w:szCs w:val="28"/>
           <w:lang w:val="en-US"/>
         </w:rPr>
-        <w:t xml:space="preserve">Data </w:t>
-      </w:r>
-      <w:proofErr w:type="spellStart"/>
-      <w:r>
-        <w:rPr>
-          <w:rFonts w:ascii="Times New Roman" w:hAnsi="Times New Roman" w:cs="Times New Roman"/>
-          <w:sz w:val="28"/>
-          <w:szCs w:val="28"/>
-          <w:lang w:val="en-US"/>
-        </w:rPr>
-        <w:t>được</w:t>
-      </w:r>
-      <w:proofErr w:type="spellEnd"/>
-      <w:r>
-        <w:rPr>
-          <w:rFonts w:ascii="Times New Roman" w:hAnsi="Times New Roman" w:cs="Times New Roman"/>
-          <w:sz w:val="28"/>
-          <w:szCs w:val="28"/>
-          <w:lang w:val="en-US"/>
-        </w:rPr>
-        <w:t xml:space="preserve"> </w:t>
-      </w:r>
-      <w:proofErr w:type="spellStart"/>
-      <w:r>
-        <w:rPr>
-          <w:rFonts w:ascii="Times New Roman" w:hAnsi="Times New Roman" w:cs="Times New Roman"/>
-          <w:sz w:val="28"/>
-          <w:szCs w:val="28"/>
-          <w:lang w:val="en-US"/>
-        </w:rPr>
-        <w:t>lấy</w:t>
-      </w:r>
-      <w:proofErr w:type="spellEnd"/>
-      <w:r>
-        <w:rPr>
-          <w:rFonts w:ascii="Times New Roman" w:hAnsi="Times New Roman" w:cs="Times New Roman"/>
-          <w:sz w:val="28"/>
-          <w:szCs w:val="28"/>
-          <w:lang w:val="en-US"/>
-        </w:rPr>
-        <w:t xml:space="preserve"> </w:t>
-      </w:r>
-      <w:proofErr w:type="spellStart"/>
-      <w:r>
-        <w:rPr>
-          <w:rFonts w:ascii="Times New Roman" w:hAnsi="Times New Roman" w:cs="Times New Roman"/>
-          <w:sz w:val="28"/>
-          <w:szCs w:val="28"/>
-          <w:lang w:val="en-US"/>
-        </w:rPr>
-        <w:t>bằng</w:t>
-      </w:r>
-      <w:proofErr w:type="spellEnd"/>
-      <w:r>
-        <w:rPr>
-          <w:rFonts w:ascii="Times New Roman" w:hAnsi="Times New Roman" w:cs="Times New Roman"/>
-          <w:sz w:val="28"/>
-          <w:szCs w:val="28"/>
-          <w:lang w:val="en-US"/>
-        </w:rPr>
-        <w:t xml:space="preserve"> </w:t>
-      </w:r>
-      <w:proofErr w:type="spellStart"/>
-      <w:r>
-        <w:rPr>
-          <w:rFonts w:ascii="Times New Roman" w:hAnsi="Times New Roman" w:cs="Times New Roman"/>
-          <w:sz w:val="28"/>
-          <w:szCs w:val="28"/>
-          <w:lang w:val="en-US"/>
-        </w:rPr>
-        <w:t>cách</w:t>
-      </w:r>
-      <w:proofErr w:type="spellEnd"/>
-      <w:r>
-        <w:rPr>
-          <w:rFonts w:ascii="Times New Roman" w:hAnsi="Times New Roman" w:cs="Times New Roman"/>
-          <w:sz w:val="28"/>
-          <w:szCs w:val="28"/>
-          <w:lang w:val="en-US"/>
-        </w:rPr>
-        <w:t xml:space="preserve"> call </w:t>
-      </w:r>
-      <w:proofErr w:type="spellStart"/>
-      <w:r>
-        <w:rPr>
-          <w:rFonts w:ascii="Times New Roman" w:hAnsi="Times New Roman" w:cs="Times New Roman"/>
-          <w:sz w:val="28"/>
-          <w:szCs w:val="28"/>
-          <w:lang w:val="en-US"/>
-        </w:rPr>
-        <w:t>api</w:t>
-      </w:r>
-      <w:proofErr w:type="spellEnd"/>
-      <w:r>
-        <w:rPr>
-          <w:rFonts w:ascii="Times New Roman" w:hAnsi="Times New Roman" w:cs="Times New Roman"/>
-          <w:sz w:val="28"/>
-          <w:szCs w:val="28"/>
-          <w:lang w:val="en-US"/>
-        </w:rPr>
-        <w:t xml:space="preserve"> </w:t>
-      </w:r>
-      <w:proofErr w:type="spellStart"/>
-      <w:r>
-        <w:rPr>
-          <w:rFonts w:ascii="Times New Roman" w:hAnsi="Times New Roman" w:cs="Times New Roman"/>
-          <w:sz w:val="28"/>
-          <w:szCs w:val="28"/>
-          <w:lang w:val="en-US"/>
-        </w:rPr>
-        <w:t>từ</w:t>
-      </w:r>
-      <w:proofErr w:type="spellEnd"/>
-      <w:r>
-        <w:rPr>
-          <w:rFonts w:ascii="Times New Roman" w:hAnsi="Times New Roman" w:cs="Times New Roman"/>
-          <w:sz w:val="28"/>
-          <w:szCs w:val="28"/>
-          <w:lang w:val="en-US"/>
-        </w:rPr>
-        <w:t xml:space="preserve"> web </w:t>
+        <w:t xml:space="preserve">Data được lấy bằng cách call api từ web </w:t>
       </w:r>
       <w:r>
         <w:rPr>
@@ -382,9 +60,19 @@
           <w:szCs w:val="28"/>
           <w:lang w:val="en-US"/>
         </w:rPr>
-        <w:t xml:space="preserve"> – </w:t>
+        <w:t xml:space="preserve"> – là web dùng để lấy dữ liệu thực miễn phí và k cần key</w:t>
       </w:r>
-      <w:proofErr w:type="spellStart"/>
+    </w:p>
+    <w:p>
+      <w:pPr>
+        <w:pStyle w:val="BodyText"/>
+        <w:rPr>
+          <w:rFonts w:ascii="Times New Roman" w:hAnsi="Times New Roman" w:cs="Times New Roman"/>
+          <w:sz w:val="28"/>
+          <w:szCs w:val="28"/>
+          <w:lang w:val="en-US"/>
+        </w:rPr>
+      </w:pPr>
       <w:r>
         <w:rPr>
           <w:rFonts w:ascii="Times New Roman" w:hAnsi="Times New Roman" w:cs="Times New Roman"/>
@@ -392,9 +80,23 @@
           <w:szCs w:val="28"/>
           <w:lang w:val="en-US"/>
         </w:rPr>
-        <w:t>là</w:t>
+        <w:t>Những điều chưa thực hiện được:</w:t>
       </w:r>
-      <w:proofErr w:type="spellEnd"/>
+    </w:p>
+    <w:p>
+      <w:pPr>
+        <w:pStyle w:val="BodyText"/>
+        <w:numPr>
+          <w:ilvl w:val="0"/>
+          <w:numId w:val="6"/>
+        </w:numPr>
+        <w:rPr>
+          <w:rFonts w:ascii="Times New Roman" w:hAnsi="Times New Roman" w:cs="Times New Roman"/>
+          <w:sz w:val="28"/>
+          <w:szCs w:val="28"/>
+          <w:lang w:val="en-US"/>
+        </w:rPr>
+      </w:pPr>
       <w:r>
         <w:rPr>
           <w:rFonts w:ascii="Times New Roman" w:hAnsi="Times New Roman" w:cs="Times New Roman"/>
@@ -402,9 +104,8 @@
           <w:szCs w:val="28"/>
           <w:lang w:val="en-US"/>
         </w:rPr>
-        <w:t xml:space="preserve"> web </w:t>
+        <w:t>Quản lí quy trình thiết kế/triển khai/vận hành</w:t>
       </w:r>
-      <w:proofErr w:type="spellStart"/>
       <w:r>
         <w:rPr>
           <w:rFonts w:ascii="Times New Roman" w:hAnsi="Times New Roman" w:cs="Times New Roman"/>
@@ -412,9 +113,23 @@
           <w:szCs w:val="28"/>
           <w:lang w:val="en-US"/>
         </w:rPr>
-        <w:t>dùng</w:t>
+        <w:t>: có pineline CLI, nhưng chưa viết tài liệu quy trình (data flow, lịch cập nhật, retry, backup)</w:t>
       </w:r>
-      <w:proofErr w:type="spellEnd"/>
+    </w:p>
+    <w:p>
+      <w:pPr>
+        <w:pStyle w:val="BodyText"/>
+        <w:numPr>
+          <w:ilvl w:val="0"/>
+          <w:numId w:val="6"/>
+        </w:numPr>
+        <w:rPr>
+          <w:rFonts w:ascii="Times New Roman" w:hAnsi="Times New Roman" w:cs="Times New Roman"/>
+          <w:sz w:val="28"/>
+          <w:szCs w:val="28"/>
+          <w:lang w:val="en-US"/>
+        </w:rPr>
+      </w:pPr>
       <w:r>
         <w:rPr>
           <w:rFonts w:ascii="Times New Roman" w:hAnsi="Times New Roman" w:cs="Times New Roman"/>
@@ -422,203 +137,8 @@
           <w:szCs w:val="28"/>
           <w:lang w:val="en-US"/>
         </w:rPr>
-        <w:t xml:space="preserve"> </w:t>
+        <w:t>Chưa đánh giá kiểm thử, mới in accuracy</w:t>
       </w:r>
-      <w:proofErr w:type="spellStart"/>
-      <w:r>
-        <w:rPr>
-          <w:rFonts w:ascii="Times New Roman" w:hAnsi="Times New Roman" w:cs="Times New Roman"/>
-          <w:sz w:val="28"/>
-          <w:szCs w:val="28"/>
-          <w:lang w:val="en-US"/>
-        </w:rPr>
-        <w:t>để</w:t>
-      </w:r>
-      <w:proofErr w:type="spellEnd"/>
-      <w:r>
-        <w:rPr>
-          <w:rFonts w:ascii="Times New Roman" w:hAnsi="Times New Roman" w:cs="Times New Roman"/>
-          <w:sz w:val="28"/>
-          <w:szCs w:val="28"/>
-          <w:lang w:val="en-US"/>
-        </w:rPr>
-        <w:t xml:space="preserve"> </w:t>
-      </w:r>
-      <w:proofErr w:type="spellStart"/>
-      <w:r>
-        <w:rPr>
-          <w:rFonts w:ascii="Times New Roman" w:hAnsi="Times New Roman" w:cs="Times New Roman"/>
-          <w:sz w:val="28"/>
-          <w:szCs w:val="28"/>
-          <w:lang w:val="en-US"/>
-        </w:rPr>
-        <w:t>lấy</w:t>
-      </w:r>
-      <w:proofErr w:type="spellEnd"/>
-      <w:r>
-        <w:rPr>
-          <w:rFonts w:ascii="Times New Roman" w:hAnsi="Times New Roman" w:cs="Times New Roman"/>
-          <w:sz w:val="28"/>
-          <w:szCs w:val="28"/>
-          <w:lang w:val="en-US"/>
-        </w:rPr>
-        <w:t xml:space="preserve"> </w:t>
-      </w:r>
-      <w:proofErr w:type="spellStart"/>
-      <w:r>
-        <w:rPr>
-          <w:rFonts w:ascii="Times New Roman" w:hAnsi="Times New Roman" w:cs="Times New Roman"/>
-          <w:sz w:val="28"/>
-          <w:szCs w:val="28"/>
-          <w:lang w:val="en-US"/>
-        </w:rPr>
-        <w:t>dữ</w:t>
-      </w:r>
-      <w:proofErr w:type="spellEnd"/>
-      <w:r>
-        <w:rPr>
-          <w:rFonts w:ascii="Times New Roman" w:hAnsi="Times New Roman" w:cs="Times New Roman"/>
-          <w:sz w:val="28"/>
-          <w:szCs w:val="28"/>
-          <w:lang w:val="en-US"/>
-        </w:rPr>
-        <w:t xml:space="preserve"> </w:t>
-      </w:r>
-      <w:proofErr w:type="spellStart"/>
-      <w:r>
-        <w:rPr>
-          <w:rFonts w:ascii="Times New Roman" w:hAnsi="Times New Roman" w:cs="Times New Roman"/>
-          <w:sz w:val="28"/>
-          <w:szCs w:val="28"/>
-          <w:lang w:val="en-US"/>
-        </w:rPr>
-        <w:t>liệu</w:t>
-      </w:r>
-      <w:proofErr w:type="spellEnd"/>
-      <w:r>
-        <w:rPr>
-          <w:rFonts w:ascii="Times New Roman" w:hAnsi="Times New Roman" w:cs="Times New Roman"/>
-          <w:sz w:val="28"/>
-          <w:szCs w:val="28"/>
-          <w:lang w:val="en-US"/>
-        </w:rPr>
-        <w:t xml:space="preserve"> </w:t>
-      </w:r>
-      <w:proofErr w:type="spellStart"/>
-      <w:r>
-        <w:rPr>
-          <w:rFonts w:ascii="Times New Roman" w:hAnsi="Times New Roman" w:cs="Times New Roman"/>
-          <w:sz w:val="28"/>
-          <w:szCs w:val="28"/>
-          <w:lang w:val="en-US"/>
-        </w:rPr>
-        <w:t>thực</w:t>
-      </w:r>
-      <w:proofErr w:type="spellEnd"/>
-      <w:r>
-        <w:rPr>
-          <w:rFonts w:ascii="Times New Roman" w:hAnsi="Times New Roman" w:cs="Times New Roman"/>
-          <w:sz w:val="28"/>
-          <w:szCs w:val="28"/>
-          <w:lang w:val="en-US"/>
-        </w:rPr>
-        <w:t xml:space="preserve"> </w:t>
-      </w:r>
-      <w:proofErr w:type="spellStart"/>
-      <w:r>
-        <w:rPr>
-          <w:rFonts w:ascii="Times New Roman" w:hAnsi="Times New Roman" w:cs="Times New Roman"/>
-          <w:sz w:val="28"/>
-          <w:szCs w:val="28"/>
-          <w:lang w:val="en-US"/>
-        </w:rPr>
-        <w:t>miễn</w:t>
-      </w:r>
-      <w:proofErr w:type="spellEnd"/>
-      <w:r>
-        <w:rPr>
-          <w:rFonts w:ascii="Times New Roman" w:hAnsi="Times New Roman" w:cs="Times New Roman"/>
-          <w:sz w:val="28"/>
-          <w:szCs w:val="28"/>
-          <w:lang w:val="en-US"/>
-        </w:rPr>
-        <w:t xml:space="preserve"> </w:t>
-      </w:r>
-      <w:proofErr w:type="spellStart"/>
-      <w:r>
-        <w:rPr>
-          <w:rFonts w:ascii="Times New Roman" w:hAnsi="Times New Roman" w:cs="Times New Roman"/>
-          <w:sz w:val="28"/>
-          <w:szCs w:val="28"/>
-          <w:lang w:val="en-US"/>
-        </w:rPr>
-        <w:t>phí</w:t>
-      </w:r>
-      <w:proofErr w:type="spellEnd"/>
-      <w:r>
-        <w:rPr>
-          <w:rFonts w:ascii="Times New Roman" w:hAnsi="Times New Roman" w:cs="Times New Roman"/>
-          <w:sz w:val="28"/>
-          <w:szCs w:val="28"/>
-          <w:lang w:val="en-US"/>
-        </w:rPr>
-        <w:t xml:space="preserve"> </w:t>
-      </w:r>
-      <w:proofErr w:type="spellStart"/>
-      <w:r>
-        <w:rPr>
-          <w:rFonts w:ascii="Times New Roman" w:hAnsi="Times New Roman" w:cs="Times New Roman"/>
-          <w:sz w:val="28"/>
-          <w:szCs w:val="28"/>
-          <w:lang w:val="en-US"/>
-        </w:rPr>
-        <w:t>và</w:t>
-      </w:r>
-      <w:proofErr w:type="spellEnd"/>
-      <w:r>
-        <w:rPr>
-          <w:rFonts w:ascii="Times New Roman" w:hAnsi="Times New Roman" w:cs="Times New Roman"/>
-          <w:sz w:val="28"/>
-          <w:szCs w:val="28"/>
-          <w:lang w:val="en-US"/>
-        </w:rPr>
-        <w:t xml:space="preserve"> k </w:t>
-      </w:r>
-      <w:proofErr w:type="spellStart"/>
-      <w:r>
-        <w:rPr>
-          <w:rFonts w:ascii="Times New Roman" w:hAnsi="Times New Roman" w:cs="Times New Roman"/>
-          <w:sz w:val="28"/>
-          <w:szCs w:val="28"/>
-          <w:lang w:val="en-US"/>
-        </w:rPr>
-        <w:t>cần</w:t>
-      </w:r>
-      <w:proofErr w:type="spellEnd"/>
-      <w:r>
-        <w:rPr>
-          <w:rFonts w:ascii="Times New Roman" w:hAnsi="Times New Roman" w:cs="Times New Roman"/>
-          <w:sz w:val="28"/>
-          <w:szCs w:val="28"/>
-          <w:lang w:val="en-US"/>
-        </w:rPr>
-        <w:t xml:space="preserve"> key</w:t>
-      </w:r>
-    </w:p>
-    <w:p>
-      <w:pPr>
-        <w:pStyle w:val="BodyText"/>
-        <w:numPr>
-          <w:ilvl w:val="0"/>
-          <w:numId w:val="5"/>
-        </w:numPr>
-        <w:rPr>
-          <w:rFonts w:ascii="Times New Roman" w:hAnsi="Times New Roman" w:cs="Times New Roman"/>
-          <w:sz w:val="28"/>
-          <w:szCs w:val="28"/>
-          <w:lang w:val="en-US"/>
-        </w:rPr>
-      </w:pPr>
     </w:p>
     <w:sectPr>
       <w:footnotePr>
@@ -914,6 +434,118 @@
       </w:pPr>
       <w:rPr>
         <w:rFonts w:ascii="Wingdings" w:eastAsiaTheme="minorHAnsi" w:hAnsi="Wingdings" w:cs="Times New Roman" w:hint="default"/>
+      </w:rPr>
+    </w:lvl>
+    <w:lvl w:ilvl="1" w:tplc="04090003" w:tentative="1">
+      <w:start w:val="1"/>
+      <w:numFmt w:val="bullet"/>
+      <w:lvlText w:val="o"/>
+      <w:lvlJc w:val="left"/>
+      <w:pPr>
+        <w:ind w:left="1440" w:hanging="360"/>
+      </w:pPr>
+      <w:rPr>
+        <w:rFonts w:ascii="Courier New" w:hAnsi="Courier New" w:cs="Courier New" w:hint="default"/>
+      </w:rPr>
+    </w:lvl>
+    <w:lvl w:ilvl="2" w:tplc="04090005" w:tentative="1">
+      <w:start w:val="1"/>
+      <w:numFmt w:val="bullet"/>
+      <w:lvlText w:val=""/>
+      <w:lvlJc w:val="left"/>
+      <w:pPr>
+        <w:ind w:left="2160" w:hanging="360"/>
+      </w:pPr>
+      <w:rPr>
+        <w:rFonts w:ascii="Wingdings" w:hAnsi="Wingdings" w:hint="default"/>
+      </w:rPr>
+    </w:lvl>
+    <w:lvl w:ilvl="3" w:tplc="04090001" w:tentative="1">
+      <w:start w:val="1"/>
+      <w:numFmt w:val="bullet"/>
+      <w:lvlText w:val=""/>
+      <w:lvlJc w:val="left"/>
+      <w:pPr>
+        <w:ind w:left="2880" w:hanging="360"/>
+      </w:pPr>
+      <w:rPr>
+        <w:rFonts w:ascii="Symbol" w:hAnsi="Symbol" w:hint="default"/>
+      </w:rPr>
+    </w:lvl>
+    <w:lvl w:ilvl="4" w:tplc="04090003" w:tentative="1">
+      <w:start w:val="1"/>
+      <w:numFmt w:val="bullet"/>
+      <w:lvlText w:val="o"/>
+      <w:lvlJc w:val="left"/>
+      <w:pPr>
+        <w:ind w:left="3600" w:hanging="360"/>
+      </w:pPr>
+      <w:rPr>
+        <w:rFonts w:ascii="Courier New" w:hAnsi="Courier New" w:cs="Courier New" w:hint="default"/>
+      </w:rPr>
+    </w:lvl>
+    <w:lvl w:ilvl="5" w:tplc="04090005" w:tentative="1">
+      <w:start w:val="1"/>
+      <w:numFmt w:val="bullet"/>
+      <w:lvlText w:val=""/>
+      <w:lvlJc w:val="left"/>
+      <w:pPr>
+        <w:ind w:left="4320" w:hanging="360"/>
+      </w:pPr>
+      <w:rPr>
+        <w:rFonts w:ascii="Wingdings" w:hAnsi="Wingdings" w:hint="default"/>
+      </w:rPr>
+    </w:lvl>
+    <w:lvl w:ilvl="6" w:tplc="04090001" w:tentative="1">
+      <w:start w:val="1"/>
+      <w:numFmt w:val="bullet"/>
+      <w:lvlText w:val=""/>
+      <w:lvlJc w:val="left"/>
+      <w:pPr>
+        <w:ind w:left="5040" w:hanging="360"/>
+      </w:pPr>
+      <w:rPr>
+        <w:rFonts w:ascii="Symbol" w:hAnsi="Symbol" w:hint="default"/>
+      </w:rPr>
+    </w:lvl>
+    <w:lvl w:ilvl="7" w:tplc="04090003" w:tentative="1">
+      <w:start w:val="1"/>
+      <w:numFmt w:val="bullet"/>
+      <w:lvlText w:val="o"/>
+      <w:lvlJc w:val="left"/>
+      <w:pPr>
+        <w:ind w:left="5760" w:hanging="360"/>
+      </w:pPr>
+      <w:rPr>
+        <w:rFonts w:ascii="Courier New" w:hAnsi="Courier New" w:cs="Courier New" w:hint="default"/>
+      </w:rPr>
+    </w:lvl>
+    <w:lvl w:ilvl="8" w:tplc="04090005" w:tentative="1">
+      <w:start w:val="1"/>
+      <w:numFmt w:val="bullet"/>
+      <w:lvlText w:val=""/>
+      <w:lvlJc w:val="left"/>
+      <w:pPr>
+        <w:ind w:left="6480" w:hanging="360"/>
+      </w:pPr>
+      <w:rPr>
+        <w:rFonts w:ascii="Wingdings" w:hAnsi="Wingdings" w:hint="default"/>
+      </w:rPr>
+    </w:lvl>
+  </w:abstractNum>
+  <w:abstractNum w:abstractNumId="4" w15:restartNumberingAfterBreak="0">
+    <w:nsid w:val="4F3140E7"/>
+    <w:multiLevelType w:val="hybridMultilevel"/>
+    <w:tmpl w:val="432C5DDC"/>
+    <w:lvl w:ilvl="0" w:tplc="BE86D0F8">
+      <w:numFmt w:val="bullet"/>
+      <w:lvlText w:val="-"/>
+      <w:lvlJc w:val="left"/>
+      <w:pPr>
+        <w:ind w:left="720" w:hanging="360"/>
+      </w:pPr>
+      <w:rPr>
+        <w:rFonts w:ascii="Times New Roman" w:eastAsiaTheme="minorHAnsi" w:hAnsi="Times New Roman" w:cs="Times New Roman" w:hint="default"/>
       </w:rPr>
     </w:lvl>
     <w:lvl w:ilvl="1" w:tplc="04090003" w:tentative="1">
@@ -1054,6 +686,9 @@
   </w:num>
   <w:num w:numId="5" w16cid:durableId="1016077263">
     <w:abstractNumId w:val="3"/>
+  </w:num>
+  <w:num w:numId="6" w16cid:durableId="1837260081">
+    <w:abstractNumId w:val="4"/>
   </w:num>
 </w:numbering>
 </file>
@@ -1525,6 +1160,7 @@
   <w:style w:type="character" w:default="1" w:styleId="DefaultParagraphFont">
     <w:name w:val="Default Paragraph Font"/>
     <w:uiPriority w:val="1"/>
+    <w:semiHidden/>
     <w:unhideWhenUsed/>
   </w:style>
   <w:style w:type="table" w:default="1" w:styleId="TableNormal">

</xml_diff>